<commit_message>
feat/docs: add sigmoid modification and update latex article results
</commit_message>
<xml_diff>
--- a/Promt da Atividade 02 CNN.docx
+++ b/Promt da Atividade 02 CNN.docx
@@ -1710,6 +1710,460 @@
       </w:r>
     </w:p>
     <w:p/>
+    <w:p>
+      <w:pPr>
+        <w:rPr>
+          <w:b/>
+          <w:bCs/>
+          <w:sz w:val="28"/>
+          <w:szCs w:val="28"/>
+        </w:rPr>
+      </w:pPr>
+      <w:r>
+        <w:rPr>
+          <w:b/>
+          <w:bCs/>
+          <w:sz w:val="28"/>
+          <w:szCs w:val="28"/>
+        </w:rPr>
+        <w:t>Detalhes do artigo escolhido</w:t>
+      </w:r>
+      <w:r>
+        <w:rPr>
+          <w:b/>
+          <w:bCs/>
+          <w:sz w:val="28"/>
+          <w:szCs w:val="28"/>
+        </w:rPr>
+        <w:t xml:space="preserve"> para o estudo dessa atividade</w:t>
+      </w:r>
+    </w:p>
+    <w:p>
+      <w:r>
+        <w:t>O Artigo Científico Escolhido</w:t>
+      </w:r>
+    </w:p>
+    <w:p>
+      <w:r>
+        <w:t>Para essa atividade, nós nos baseamos no seguinte artigo:</w:t>
+      </w:r>
+    </w:p>
+    <w:p>
+      <w:pPr>
+        <w:numPr>
+          <w:ilvl w:val="0"/>
+          <w:numId w:val="9"/>
+        </w:numPr>
+      </w:pPr>
+      <w:r>
+        <w:rPr>
+          <w:b/>
+          <w:bCs/>
+        </w:rPr>
+        <w:t>Título</w:t>
+      </w:r>
+      <w:r>
+        <w:t>: </w:t>
+      </w:r>
+      <w:r>
+        <w:rPr>
+          <w:i/>
+          <w:iCs/>
+        </w:rPr>
+        <w:t>"</w:t>
+      </w:r>
+      <w:proofErr w:type="spellStart"/>
+      <w:r>
+        <w:rPr>
+          <w:i/>
+          <w:iCs/>
+        </w:rPr>
+        <w:t>Empirical</w:t>
+      </w:r>
+      <w:proofErr w:type="spellEnd"/>
+      <w:r>
+        <w:rPr>
+          <w:i/>
+          <w:iCs/>
+        </w:rPr>
+        <w:t xml:space="preserve"> </w:t>
+      </w:r>
+      <w:proofErr w:type="spellStart"/>
+      <w:r>
+        <w:rPr>
+          <w:i/>
+          <w:iCs/>
+        </w:rPr>
+        <w:t>Ablation</w:t>
+      </w:r>
+      <w:proofErr w:type="spellEnd"/>
+      <w:r>
+        <w:rPr>
+          <w:i/>
+          <w:iCs/>
+        </w:rPr>
+        <w:t xml:space="preserve"> </w:t>
+      </w:r>
+      <w:proofErr w:type="spellStart"/>
+      <w:r>
+        <w:rPr>
+          <w:i/>
+          <w:iCs/>
+        </w:rPr>
+        <w:t>and</w:t>
+      </w:r>
+      <w:proofErr w:type="spellEnd"/>
+      <w:r>
+        <w:rPr>
+          <w:i/>
+          <w:iCs/>
+        </w:rPr>
+        <w:t xml:space="preserve"> Ensemble </w:t>
+      </w:r>
+      <w:proofErr w:type="spellStart"/>
+      <w:r>
+        <w:rPr>
+          <w:i/>
+          <w:iCs/>
+        </w:rPr>
+        <w:t>Optimization</w:t>
+      </w:r>
+      <w:proofErr w:type="spellEnd"/>
+      <w:r>
+        <w:rPr>
+          <w:i/>
+          <w:iCs/>
+        </w:rPr>
+        <w:t xml:space="preserve"> </w:t>
+      </w:r>
+      <w:proofErr w:type="spellStart"/>
+      <w:r>
+        <w:rPr>
+          <w:i/>
+          <w:iCs/>
+        </w:rPr>
+        <w:t>of</w:t>
+      </w:r>
+      <w:proofErr w:type="spellEnd"/>
+      <w:r>
+        <w:rPr>
+          <w:i/>
+          <w:iCs/>
+        </w:rPr>
+        <w:t xml:space="preserve"> a </w:t>
+      </w:r>
+      <w:proofErr w:type="spellStart"/>
+      <w:r>
+        <w:rPr>
+          <w:i/>
+          <w:iCs/>
+        </w:rPr>
+        <w:t>Convolutional</w:t>
+      </w:r>
+      <w:proofErr w:type="spellEnd"/>
+      <w:r>
+        <w:rPr>
+          <w:i/>
+          <w:iCs/>
+        </w:rPr>
+        <w:t xml:space="preserve"> Neural Network for CIFAR-10 </w:t>
+      </w:r>
+      <w:proofErr w:type="spellStart"/>
+      <w:r>
+        <w:rPr>
+          <w:i/>
+          <w:iCs/>
+        </w:rPr>
+        <w:t>Classification</w:t>
+      </w:r>
+      <w:proofErr w:type="spellEnd"/>
+      <w:r>
+        <w:rPr>
+          <w:i/>
+          <w:iCs/>
+        </w:rPr>
+        <w:t>"</w:t>
+      </w:r>
+    </w:p>
+    <w:p>
+      <w:pPr>
+        <w:numPr>
+          <w:ilvl w:val="0"/>
+          <w:numId w:val="9"/>
+        </w:numPr>
+      </w:pPr>
+      <w:r>
+        <w:rPr>
+          <w:b/>
+          <w:bCs/>
+        </w:rPr>
+        <w:t>Data de Publicação</w:t>
+      </w:r>
+      <w:r>
+        <w:t xml:space="preserve">: 26 de </w:t>
+      </w:r>
+      <w:proofErr w:type="gramStart"/>
+      <w:r>
+        <w:t>Abril</w:t>
+      </w:r>
+      <w:proofErr w:type="gramEnd"/>
+      <w:r>
+        <w:t xml:space="preserve"> de 2026 </w:t>
+      </w:r>
+      <w:r>
+        <w:rPr>
+          <w:i/>
+          <w:iCs/>
+        </w:rPr>
+        <w:t>(Atende perfeitamente ao requisito de ser um estudo recente, pós 2023)</w:t>
+      </w:r>
+    </w:p>
+    <w:p>
+      <w:pPr>
+        <w:numPr>
+          <w:ilvl w:val="0"/>
+          <w:numId w:val="9"/>
+        </w:numPr>
+      </w:pPr>
+      <w:r>
+        <w:rPr>
+          <w:b/>
+          <w:bCs/>
+        </w:rPr>
+        <w:t>Link Oficial</w:t>
+      </w:r>
+      <w:r>
+        <w:t>: </w:t>
+      </w:r>
+      <w:hyperlink r:id="rId6" w:history="1">
+        <w:r>
+          <w:rPr>
+            <w:rStyle w:val="Hyperlink"/>
+          </w:rPr>
+          <w:t>http://arxiv.org/abs/2604.23861v1</w:t>
+        </w:r>
+      </w:hyperlink>
+    </w:p>
+    <w:p>
+      <w:r>
+        <w:t>A Fonte de Onde Foi Extraído</w:t>
+      </w:r>
+    </w:p>
+    <w:p>
+      <w:r>
+        <w:t>Este artigo foi extraído do </w:t>
+      </w:r>
+      <w:proofErr w:type="spellStart"/>
+      <w:r>
+        <w:rPr>
+          <w:b/>
+          <w:bCs/>
+        </w:rPr>
+        <w:t>arXiv</w:t>
+      </w:r>
+      <w:proofErr w:type="spellEnd"/>
+      <w:r>
+        <w:t xml:space="preserve"> (mantido pela Universidade de Cornell). O </w:t>
+      </w:r>
+      <w:proofErr w:type="spellStart"/>
+      <w:r>
+        <w:t>arXiv</w:t>
+      </w:r>
+      <w:proofErr w:type="spellEnd"/>
+      <w:r>
+        <w:t xml:space="preserve"> é um dos maiores e mais respeitados repositórios mundiais de </w:t>
+      </w:r>
+      <w:proofErr w:type="spellStart"/>
+      <w:r>
+        <w:rPr>
+          <w:i/>
+          <w:iCs/>
+        </w:rPr>
+        <w:t>preprints</w:t>
+      </w:r>
+      <w:proofErr w:type="spellEnd"/>
+      <w:r>
+        <w:t> abertos para pesquisas nas áreas de Ciência da Computação, Inteligência Artificial e Física. Extraímos diretamente de lá através da API pública deles.</w:t>
+      </w:r>
+    </w:p>
+    <w:p>
+      <w:r>
+        <w:lastRenderedPageBreak/>
+        <w:t xml:space="preserve">Por que ele usa exatamente o nosso </w:t>
+      </w:r>
+      <w:proofErr w:type="spellStart"/>
+      <w:r>
+        <w:t>Dataset</w:t>
+      </w:r>
+      <w:proofErr w:type="spellEnd"/>
+      <w:r>
+        <w:t>?</w:t>
+      </w:r>
+    </w:p>
+    <w:p>
+      <w:r>
+        <w:t>Como o próprio título do artigo diz (</w:t>
+      </w:r>
+      <w:r>
+        <w:rPr>
+          <w:i/>
+          <w:iCs/>
+        </w:rPr>
+        <w:t xml:space="preserve">"for CIFAR-10 </w:t>
+      </w:r>
+      <w:proofErr w:type="spellStart"/>
+      <w:r>
+        <w:rPr>
+          <w:i/>
+          <w:iCs/>
+        </w:rPr>
+        <w:t>Classification</w:t>
+      </w:r>
+      <w:proofErr w:type="spellEnd"/>
+      <w:r>
+        <w:rPr>
+          <w:i/>
+          <w:iCs/>
+        </w:rPr>
+        <w:t>"</w:t>
+      </w:r>
+      <w:r>
+        <w:t>), o estudo é </w:t>
+      </w:r>
+      <w:r>
+        <w:rPr>
+          <w:b/>
+          <w:bCs/>
+        </w:rPr>
+        <w:t xml:space="preserve">totalmente embasado e focado no </w:t>
+      </w:r>
+      <w:proofErr w:type="spellStart"/>
+      <w:r>
+        <w:rPr>
+          <w:b/>
+          <w:bCs/>
+        </w:rPr>
+        <w:t>dataset</w:t>
+      </w:r>
+      <w:proofErr w:type="spellEnd"/>
+      <w:r>
+        <w:rPr>
+          <w:b/>
+          <w:bCs/>
+        </w:rPr>
+        <w:t xml:space="preserve"> CIFAR-10</w:t>
+      </w:r>
+      <w:r>
+        <w:t>, que é exatamente a mesma base de dados que escolhemos e implementamos no nosso código </w:t>
+      </w:r>
+      <w:proofErr w:type="spellStart"/>
+      <w:r>
+        <w:t>code</w:t>
+      </w:r>
+      <w:proofErr w:type="spellEnd"/>
+      <w:r>
+        <w:t>/main.py.</w:t>
+      </w:r>
+    </w:p>
+    <w:p>
+      <w:r>
+        <w:t xml:space="preserve">O </w:t>
+      </w:r>
+      <w:proofErr w:type="spellStart"/>
+      <w:r>
+        <w:t>dataset</w:t>
+      </w:r>
+      <w:proofErr w:type="spellEnd"/>
+      <w:r>
+        <w:t xml:space="preserve"> CIFAR-10 original (de Alex </w:t>
+      </w:r>
+      <w:proofErr w:type="spellStart"/>
+      <w:r>
+        <w:t>Krizhevsky</w:t>
+      </w:r>
+      <w:proofErr w:type="spellEnd"/>
+      <w:r>
+        <w:t xml:space="preserve">) contém 60.000 imagens comuns (cachorros, gatos, aviões, </w:t>
+      </w:r>
+      <w:proofErr w:type="gramStart"/>
+      <w:r>
+        <w:t>carros, etc.</w:t>
+      </w:r>
+      <w:proofErr w:type="gramEnd"/>
+      <w:r>
+        <w:t>) em resolução 32x32.</w:t>
+      </w:r>
+    </w:p>
+    <w:p>
+      <w:r>
+        <w:rPr>
+          <w:b/>
+          <w:bCs/>
+        </w:rPr>
+        <w:t>A conexão entre o artigo e a nossa entrega:</w:t>
+      </w:r>
+      <w:r>
+        <w:t> O termo </w:t>
+      </w:r>
+      <w:r>
+        <w:rPr>
+          <w:i/>
+          <w:iCs/>
+        </w:rPr>
+        <w:t>"</w:t>
+      </w:r>
+      <w:proofErr w:type="spellStart"/>
+      <w:r>
+        <w:rPr>
+          <w:i/>
+          <w:iCs/>
+        </w:rPr>
+        <w:t>Empirical</w:t>
+      </w:r>
+      <w:proofErr w:type="spellEnd"/>
+      <w:r>
+        <w:rPr>
+          <w:i/>
+          <w:iCs/>
+        </w:rPr>
+        <w:t xml:space="preserve"> </w:t>
+      </w:r>
+      <w:proofErr w:type="spellStart"/>
+      <w:r>
+        <w:rPr>
+          <w:i/>
+          <w:iCs/>
+        </w:rPr>
+        <w:t>Ablation</w:t>
+      </w:r>
+      <w:proofErr w:type="spellEnd"/>
+      <w:r>
+        <w:rPr>
+          <w:i/>
+          <w:iCs/>
+        </w:rPr>
+        <w:t>"</w:t>
+      </w:r>
+      <w:r>
+        <w:t xml:space="preserve"> no título do artigo refere-se ao conceito de "estudo de ablação" — que nada mais é do que adicionar ou remover pedaços da arquitetura da rede (como o </w:t>
+      </w:r>
+      <w:proofErr w:type="spellStart"/>
+      <w:r>
+        <w:t>Dropout</w:t>
+      </w:r>
+      <w:proofErr w:type="spellEnd"/>
+      <w:r>
+        <w:t xml:space="preserve">, as camadas de Convolução e as Funções de Ativação) para entender o impacto dessas mudanças no aprendizado. Ou seja, o que o professor pediu (fazer as 3 mudanças na arquitetura e documentar o impacto na Tabela) é exatamente o que os autores deste artigo científico recente fizeram para o </w:t>
+      </w:r>
+      <w:proofErr w:type="spellStart"/>
+      <w:r>
+        <w:t>dataset</w:t>
+      </w:r>
+      <w:proofErr w:type="spellEnd"/>
+      <w:r>
+        <w:t xml:space="preserve"> CIFAR-10!</w:t>
+      </w:r>
+    </w:p>
     <w:p/>
     <w:sectPr>
       <w:pgSz w:w="11906" w:h="16838"/>
@@ -1724,6 +2178,155 @@
 <file path=word/numbering.xml><?xml version="1.0" encoding="utf-8"?>
 <w:numbering xmlns:wpc="http://schemas.microsoft.com/office/word/2010/wordprocessingCanvas" xmlns:cx="http://schemas.microsoft.com/office/drawing/2014/chartex" xmlns:cx1="http://schemas.microsoft.com/office/drawing/2015/9/8/chartex" xmlns:cx2="http://schemas.microsoft.com/office/drawing/2015/10/21/chartex" xmlns:cx3="http://schemas.microsoft.com/office/drawing/2016/5/9/chartex" xmlns:cx4="http://schemas.microsoft.com/office/drawing/2016/5/10/chartex" xmlns:cx5="http://schemas.microsoft.com/office/drawing/2016/5/11/chartex" xmlns:cx6="http://schemas.microsoft.com/office/drawing/2016/5/12/chartex" xmlns:cx7="http://schemas.microsoft.com/office/drawing/2016/5/13/chartex" xmlns:cx8="http://schemas.microsoft.com/office/drawing/2016/5/14/chartex" xmlns:mc="http://schemas.openxmlformats.org/markup-compatibility/2006" xmlns:aink="http://schemas.microsoft.com/office/drawing/2016/ink" xmlns:am3d="http://schemas.microsoft.com/office/drawing/2017/model3d" xmlns:o="urn:schemas-microsoft-com:office:office" xmlns:oel="http://schemas.microsoft.com/office/2019/extlst" xmlns:r="http://schemas.openxmlformats.org/officeDocument/2006/relationships" xmlns:m="http://schemas.openxmlformats.org/officeDocument/2006/math" xmlns:v="urn:schemas-microsoft-com:vml" xmlns:wp14="http://schemas.microsoft.com/office/word/2010/wordprocessingDrawing" xmlns:wp="http://schemas.openxmlformats.org/drawingml/2006/wordprocessingDrawing" xmlns:w10="urn:schemas-microsoft-com:office:word" xmlns:w="http://schemas.openxmlformats.org/wordprocessingml/2006/main" xmlns:w14="http://schemas.microsoft.com/office/word/2010/wordml" xmlns:w15="http://schemas.microsoft.com/office/word/2012/wordml" xmlns:w16cex="http://schemas.microsoft.com/office/word/2018/wordml/cex" xmlns:w16cid="http://schemas.microsoft.com/office/word/2016/wordml/cid" xmlns:w16="http://schemas.microsoft.com/office/word/2018/wordml" xmlns:w16du="http://schemas.microsoft.com/office/word/2023/wordml/word16du" xmlns:w16sdtdh="http://schemas.microsoft.com/office/word/2020/wordml/sdtdatahash" xmlns:w16se="http://schemas.microsoft.com/office/word/2015/wordml/symex" xmlns:wpg="http://schemas.microsoft.com/office/word/2010/wordprocessingGroup" xmlns:wpi="http://schemas.microsoft.com/office/word/2010/wordprocessingInk" xmlns:wne="http://schemas.microsoft.com/office/word/2006/wordml" xmlns:wps="http://schemas.microsoft.com/office/word/2010/wordprocessingShape" mc:Ignorable="w14 w15 w16se w16cid w16 w16cex w16sdtdh w16du wp14">
   <w:abstractNum w:abstractNumId="0" w15:restartNumberingAfterBreak="0">
+    <w:nsid w:val="119128F2"/>
+    <w:multiLevelType w:val="multilevel"/>
+    <w:tmpl w:val="0BEEE5B0"/>
+    <w:lvl w:ilvl="0">
+      <w:start w:val="1"/>
+      <w:numFmt w:val="bullet"/>
+      <w:lvlText w:val=""/>
+      <w:lvlJc w:val="left"/>
+      <w:pPr>
+        <w:tabs>
+          <w:tab w:val="num" w:pos="720"/>
+        </w:tabs>
+        <w:ind w:left="720" w:hanging="360"/>
+      </w:pPr>
+      <w:rPr>
+        <w:rFonts w:ascii="Symbol" w:hAnsi="Symbol" w:hint="default"/>
+        <w:sz w:val="20"/>
+      </w:rPr>
+    </w:lvl>
+    <w:lvl w:ilvl="1" w:tentative="1">
+      <w:start w:val="1"/>
+      <w:numFmt w:val="bullet"/>
+      <w:lvlText w:val=""/>
+      <w:lvlJc w:val="left"/>
+      <w:pPr>
+        <w:tabs>
+          <w:tab w:val="num" w:pos="1440"/>
+        </w:tabs>
+        <w:ind w:left="1440" w:hanging="360"/>
+      </w:pPr>
+      <w:rPr>
+        <w:rFonts w:ascii="Symbol" w:hAnsi="Symbol" w:hint="default"/>
+        <w:sz w:val="20"/>
+      </w:rPr>
+    </w:lvl>
+    <w:lvl w:ilvl="2" w:tentative="1">
+      <w:start w:val="1"/>
+      <w:numFmt w:val="bullet"/>
+      <w:lvlText w:val=""/>
+      <w:lvlJc w:val="left"/>
+      <w:pPr>
+        <w:tabs>
+          <w:tab w:val="num" w:pos="2160"/>
+        </w:tabs>
+        <w:ind w:left="2160" w:hanging="360"/>
+      </w:pPr>
+      <w:rPr>
+        <w:rFonts w:ascii="Symbol" w:hAnsi="Symbol" w:hint="default"/>
+        <w:sz w:val="20"/>
+      </w:rPr>
+    </w:lvl>
+    <w:lvl w:ilvl="3" w:tentative="1">
+      <w:start w:val="1"/>
+      <w:numFmt w:val="bullet"/>
+      <w:lvlText w:val=""/>
+      <w:lvlJc w:val="left"/>
+      <w:pPr>
+        <w:tabs>
+          <w:tab w:val="num" w:pos="2880"/>
+        </w:tabs>
+        <w:ind w:left="2880" w:hanging="360"/>
+      </w:pPr>
+      <w:rPr>
+        <w:rFonts w:ascii="Symbol" w:hAnsi="Symbol" w:hint="default"/>
+        <w:sz w:val="20"/>
+      </w:rPr>
+    </w:lvl>
+    <w:lvl w:ilvl="4" w:tentative="1">
+      <w:start w:val="1"/>
+      <w:numFmt w:val="bullet"/>
+      <w:lvlText w:val=""/>
+      <w:lvlJc w:val="left"/>
+      <w:pPr>
+        <w:tabs>
+          <w:tab w:val="num" w:pos="3600"/>
+        </w:tabs>
+        <w:ind w:left="3600" w:hanging="360"/>
+      </w:pPr>
+      <w:rPr>
+        <w:rFonts w:ascii="Symbol" w:hAnsi="Symbol" w:hint="default"/>
+        <w:sz w:val="20"/>
+      </w:rPr>
+    </w:lvl>
+    <w:lvl w:ilvl="5" w:tentative="1">
+      <w:start w:val="1"/>
+      <w:numFmt w:val="bullet"/>
+      <w:lvlText w:val=""/>
+      <w:lvlJc w:val="left"/>
+      <w:pPr>
+        <w:tabs>
+          <w:tab w:val="num" w:pos="4320"/>
+        </w:tabs>
+        <w:ind w:left="4320" w:hanging="360"/>
+      </w:pPr>
+      <w:rPr>
+        <w:rFonts w:ascii="Symbol" w:hAnsi="Symbol" w:hint="default"/>
+        <w:sz w:val="20"/>
+      </w:rPr>
+    </w:lvl>
+    <w:lvl w:ilvl="6" w:tentative="1">
+      <w:start w:val="1"/>
+      <w:numFmt w:val="bullet"/>
+      <w:lvlText w:val=""/>
+      <w:lvlJc w:val="left"/>
+      <w:pPr>
+        <w:tabs>
+          <w:tab w:val="num" w:pos="5040"/>
+        </w:tabs>
+        <w:ind w:left="5040" w:hanging="360"/>
+      </w:pPr>
+      <w:rPr>
+        <w:rFonts w:ascii="Symbol" w:hAnsi="Symbol" w:hint="default"/>
+        <w:sz w:val="20"/>
+      </w:rPr>
+    </w:lvl>
+    <w:lvl w:ilvl="7" w:tentative="1">
+      <w:start w:val="1"/>
+      <w:numFmt w:val="bullet"/>
+      <w:lvlText w:val=""/>
+      <w:lvlJc w:val="left"/>
+      <w:pPr>
+        <w:tabs>
+          <w:tab w:val="num" w:pos="5760"/>
+        </w:tabs>
+        <w:ind w:left="5760" w:hanging="360"/>
+      </w:pPr>
+      <w:rPr>
+        <w:rFonts w:ascii="Symbol" w:hAnsi="Symbol" w:hint="default"/>
+        <w:sz w:val="20"/>
+      </w:rPr>
+    </w:lvl>
+    <w:lvl w:ilvl="8" w:tentative="1">
+      <w:start w:val="1"/>
+      <w:numFmt w:val="bullet"/>
+      <w:lvlText w:val=""/>
+      <w:lvlJc w:val="left"/>
+      <w:pPr>
+        <w:tabs>
+          <w:tab w:val="num" w:pos="6480"/>
+        </w:tabs>
+        <w:ind w:left="6480" w:hanging="360"/>
+      </w:pPr>
+      <w:rPr>
+        <w:rFonts w:ascii="Symbol" w:hAnsi="Symbol" w:hint="default"/>
+        <w:sz w:val="20"/>
+      </w:rPr>
+    </w:lvl>
+  </w:abstractNum>
+  <w:abstractNum w:abstractNumId="1" w15:restartNumberingAfterBreak="0">
     <w:nsid w:val="11A35BE3"/>
     <w:multiLevelType w:val="multilevel"/>
     <w:tmpl w:val="C2E8F35E"/>
@@ -1872,7 +2475,7 @@
       </w:rPr>
     </w:lvl>
   </w:abstractNum>
-  <w:abstractNum w:abstractNumId="1" w15:restartNumberingAfterBreak="0">
+  <w:abstractNum w:abstractNumId="2" w15:restartNumberingAfterBreak="0">
     <w:nsid w:val="2D17181E"/>
     <w:multiLevelType w:val="multilevel"/>
     <w:tmpl w:val="D95ADF8C"/>
@@ -2021,7 +2624,7 @@
       </w:rPr>
     </w:lvl>
   </w:abstractNum>
-  <w:abstractNum w:abstractNumId="2" w15:restartNumberingAfterBreak="0">
+  <w:abstractNum w:abstractNumId="3" w15:restartNumberingAfterBreak="0">
     <w:nsid w:val="30D10475"/>
     <w:multiLevelType w:val="multilevel"/>
     <w:tmpl w:val="5A889FEA"/>
@@ -2170,7 +2773,7 @@
       </w:rPr>
     </w:lvl>
   </w:abstractNum>
-  <w:abstractNum w:abstractNumId="3" w15:restartNumberingAfterBreak="0">
+  <w:abstractNum w:abstractNumId="4" w15:restartNumberingAfterBreak="0">
     <w:nsid w:val="36DF3F95"/>
     <w:multiLevelType w:val="multilevel"/>
     <w:tmpl w:val="093CB8B0"/>
@@ -2319,7 +2922,7 @@
       </w:rPr>
     </w:lvl>
   </w:abstractNum>
-  <w:abstractNum w:abstractNumId="4" w15:restartNumberingAfterBreak="0">
+  <w:abstractNum w:abstractNumId="5" w15:restartNumberingAfterBreak="0">
     <w:nsid w:val="48214BC0"/>
     <w:multiLevelType w:val="multilevel"/>
     <w:tmpl w:val="739CAAF4"/>
@@ -2468,7 +3071,7 @@
       </w:rPr>
     </w:lvl>
   </w:abstractNum>
-  <w:abstractNum w:abstractNumId="5" w15:restartNumberingAfterBreak="0">
+  <w:abstractNum w:abstractNumId="6" w15:restartNumberingAfterBreak="0">
     <w:nsid w:val="4ADF22ED"/>
     <w:multiLevelType w:val="multilevel"/>
     <w:tmpl w:val="1C38019E"/>
@@ -2617,7 +3220,7 @@
       </w:rPr>
     </w:lvl>
   </w:abstractNum>
-  <w:abstractNum w:abstractNumId="6" w15:restartNumberingAfterBreak="0">
+  <w:abstractNum w:abstractNumId="7" w15:restartNumberingAfterBreak="0">
     <w:nsid w:val="60334A23"/>
     <w:multiLevelType w:val="multilevel"/>
     <w:tmpl w:val="C94E62AC"/>
@@ -2766,7 +3369,7 @@
       </w:rPr>
     </w:lvl>
   </w:abstractNum>
-  <w:abstractNum w:abstractNumId="7" w15:restartNumberingAfterBreak="0">
+  <w:abstractNum w:abstractNumId="8" w15:restartNumberingAfterBreak="0">
     <w:nsid w:val="65BC18C0"/>
     <w:multiLevelType w:val="multilevel"/>
     <w:tmpl w:val="46E67BBE"/>
@@ -2916,27 +3519,30 @@
     </w:lvl>
   </w:abstractNum>
   <w:num w:numId="1" w16cid:durableId="1946964955">
+    <w:abstractNumId w:val="7"/>
+  </w:num>
+  <w:num w:numId="2" w16cid:durableId="1808741236">
+    <w:abstractNumId w:val="4"/>
+  </w:num>
+  <w:num w:numId="3" w16cid:durableId="623537108">
+    <w:abstractNumId w:val="3"/>
+  </w:num>
+  <w:num w:numId="4" w16cid:durableId="1602375583">
+    <w:abstractNumId w:val="8"/>
+  </w:num>
+  <w:num w:numId="5" w16cid:durableId="1823303685">
+    <w:abstractNumId w:val="5"/>
+  </w:num>
+  <w:num w:numId="6" w16cid:durableId="1082146116">
     <w:abstractNumId w:val="6"/>
   </w:num>
-  <w:num w:numId="2" w16cid:durableId="1808741236">
-    <w:abstractNumId w:val="3"/>
-  </w:num>
-  <w:num w:numId="3" w16cid:durableId="623537108">
+  <w:num w:numId="7" w16cid:durableId="1564490952">
     <w:abstractNumId w:val="2"/>
   </w:num>
-  <w:num w:numId="4" w16cid:durableId="1602375583">
-    <w:abstractNumId w:val="7"/>
-  </w:num>
-  <w:num w:numId="5" w16cid:durableId="1823303685">
-    <w:abstractNumId w:val="4"/>
-  </w:num>
-  <w:num w:numId="6" w16cid:durableId="1082146116">
-    <w:abstractNumId w:val="5"/>
-  </w:num>
-  <w:num w:numId="7" w16cid:durableId="1564490952">
+  <w:num w:numId="8" w16cid:durableId="151066379">
     <w:abstractNumId w:val="1"/>
   </w:num>
-  <w:num w:numId="8" w16cid:durableId="151066379">
+  <w:num w:numId="9" w16cid:durableId="552616529">
     <w:abstractNumId w:val="0"/>
   </w:num>
 </w:numbering>

</xml_diff>

<commit_message>
docs: fix LaTeX article by adding missing Appendix section and code snippets
</commit_message>
<xml_diff>
--- a/Promt da Atividade 02 CNN.docx
+++ b/Promt da Atividade 02 CNN.docx
@@ -162,6 +162,51 @@
     </w:p>
     <w:p>
       <w:r>
+        <w:t>Link do Artigo Científico Base (2023+)</w:t>
+      </w:r>
+      <w:r>
+        <w:t xml:space="preserve">: </w:t>
+      </w:r>
+      <w:hyperlink r:id="rId5" w:history="1">
+        <w:r>
+          <w:rPr>
+            <w:rStyle w:val="Hyperlink"/>
+            <w:b/>
+            <w:bCs/>
+          </w:rPr>
+          <w:t>https://arxiv.org/abs/2604.23861v1</w:t>
+        </w:r>
+      </w:hyperlink>
+    </w:p>
+    <w:p>
+      <w:r>
+        <w:t xml:space="preserve">Link do </w:t>
+      </w:r>
+      <w:proofErr w:type="spellStart"/>
+      <w:r>
+        <w:t>Dataset</w:t>
+      </w:r>
+      <w:proofErr w:type="spellEnd"/>
+      <w:r>
+        <w:t xml:space="preserve"> Original (CIFAR-10</w:t>
+      </w:r>
+      <w:r>
+        <w:t xml:space="preserve">): </w:t>
+      </w:r>
+      <w:hyperlink r:id="rId6" w:history="1">
+        <w:r>
+          <w:rPr>
+            <w:rStyle w:val="Hyperlink"/>
+            <w:b/>
+            <w:bCs/>
+          </w:rPr>
+          <w:t>https://www.cs.toronto.edu/~kriz/cifar.html</w:t>
+        </w:r>
+      </w:hyperlink>
+    </w:p>
+    <w:p/>
+    <w:p>
+      <w:r>
         <w:t>2. M</w:t>
       </w:r>
       <w:r>
@@ -193,6 +238,11 @@
       </w:r>
     </w:p>
     <w:p>
+      <w:pPr>
+        <w:rPr>
+          <w:noProof/>
+        </w:rPr>
+      </w:pPr>
       <w:r>
         <w:t>3.</w:t>
       </w:r>
@@ -221,6 +271,174 @@
         <w:t>, regsitre as evidências.</w:t>
       </w:r>
     </w:p>
+    <w:p>
+      <w:r>
+        <w:rPr>
+          <w:noProof/>
+        </w:rPr>
+        <w:drawing>
+          <wp:inline distT="0" distB="0" distL="0" distR="0" wp14:anchorId="242FABF4" wp14:editId="79E90519">
+            <wp:extent cx="5400040" cy="3037840"/>
+            <wp:effectExtent l="0" t="0" r="0" b="0"/>
+            <wp:docPr id="1171310564" name="Imagem 1"/>
+            <wp:cNvGraphicFramePr>
+              <a:graphicFrameLocks xmlns:a="http://schemas.openxmlformats.org/drawingml/2006/main" noChangeAspect="1"/>
+            </wp:cNvGraphicFramePr>
+            <a:graphic xmlns:a="http://schemas.openxmlformats.org/drawingml/2006/main">
+              <a:graphicData uri="http://schemas.openxmlformats.org/drawingml/2006/picture">
+                <pic:pic xmlns:pic="http://schemas.openxmlformats.org/drawingml/2006/picture">
+                  <pic:nvPicPr>
+                    <pic:cNvPr id="0" name="Picture 1"/>
+                    <pic:cNvPicPr>
+                      <a:picLocks noChangeAspect="1" noChangeArrowheads="1"/>
+                    </pic:cNvPicPr>
+                  </pic:nvPicPr>
+                  <pic:blipFill>
+                    <a:blip r:embed="rId7" cstate="print">
+                      <a:extLst>
+                        <a:ext uri="{28A0092B-C50C-407E-A947-70E740481C1C}">
+                          <a14:useLocalDpi xmlns:a14="http://schemas.microsoft.com/office/drawing/2010/main" val="0"/>
+                        </a:ext>
+                      </a:extLst>
+                    </a:blip>
+                    <a:srcRect/>
+                    <a:stretch>
+                      <a:fillRect/>
+                    </a:stretch>
+                  </pic:blipFill>
+                  <pic:spPr bwMode="auto">
+                    <a:xfrm>
+                      <a:off x="0" y="0"/>
+                      <a:ext cx="5400040" cy="3037840"/>
+                    </a:xfrm>
+                    <a:prstGeom prst="rect">
+                      <a:avLst/>
+                    </a:prstGeom>
+                    <a:noFill/>
+                    <a:ln>
+                      <a:noFill/>
+                    </a:ln>
+                  </pic:spPr>
+                </pic:pic>
+              </a:graphicData>
+            </a:graphic>
+          </wp:inline>
+        </w:drawing>
+      </w:r>
+    </w:p>
+    <w:p>
+      <w:r>
+        <w:rPr>
+          <w:noProof/>
+        </w:rPr>
+        <w:lastRenderedPageBreak/>
+        <w:drawing>
+          <wp:inline distT="0" distB="0" distL="0" distR="0" wp14:anchorId="6E1E6CF1" wp14:editId="293863F3">
+            <wp:extent cx="5391150" cy="2781300"/>
+            <wp:effectExtent l="0" t="0" r="0" b="0"/>
+            <wp:docPr id="857683019" name="Imagem 2"/>
+            <wp:cNvGraphicFramePr>
+              <a:graphicFrameLocks xmlns:a="http://schemas.openxmlformats.org/drawingml/2006/main" noChangeAspect="1"/>
+            </wp:cNvGraphicFramePr>
+            <a:graphic xmlns:a="http://schemas.openxmlformats.org/drawingml/2006/main">
+              <a:graphicData uri="http://schemas.openxmlformats.org/drawingml/2006/picture">
+                <pic:pic xmlns:pic="http://schemas.openxmlformats.org/drawingml/2006/picture">
+                  <pic:nvPicPr>
+                    <pic:cNvPr id="0" name="Picture 2"/>
+                    <pic:cNvPicPr>
+                      <a:picLocks noChangeAspect="1" noChangeArrowheads="1"/>
+                    </pic:cNvPicPr>
+                  </pic:nvPicPr>
+                  <pic:blipFill>
+                    <a:blip r:embed="rId8">
+                      <a:extLst>
+                        <a:ext uri="{28A0092B-C50C-407E-A947-70E740481C1C}">
+                          <a14:useLocalDpi xmlns:a14="http://schemas.microsoft.com/office/drawing/2010/main" val="0"/>
+                        </a:ext>
+                      </a:extLst>
+                    </a:blip>
+                    <a:srcRect/>
+                    <a:stretch>
+                      <a:fillRect/>
+                    </a:stretch>
+                  </pic:blipFill>
+                  <pic:spPr bwMode="auto">
+                    <a:xfrm>
+                      <a:off x="0" y="0"/>
+                      <a:ext cx="5391150" cy="2781300"/>
+                    </a:xfrm>
+                    <a:prstGeom prst="rect">
+                      <a:avLst/>
+                    </a:prstGeom>
+                    <a:noFill/>
+                    <a:ln>
+                      <a:noFill/>
+                    </a:ln>
+                  </pic:spPr>
+                </pic:pic>
+              </a:graphicData>
+            </a:graphic>
+          </wp:inline>
+        </w:drawing>
+      </w:r>
+    </w:p>
+    <w:p>
+      <w:r>
+        <w:rPr>
+          <w:noProof/>
+        </w:rPr>
+        <w:drawing>
+          <wp:inline distT="0" distB="0" distL="0" distR="0" wp14:anchorId="56B47AA9" wp14:editId="142B0FF0">
+            <wp:extent cx="5394960" cy="2286000"/>
+            <wp:effectExtent l="0" t="0" r="0" b="0"/>
+            <wp:docPr id="1182623851" name="Imagem 3"/>
+            <wp:cNvGraphicFramePr>
+              <a:graphicFrameLocks xmlns:a="http://schemas.openxmlformats.org/drawingml/2006/main" noChangeAspect="1"/>
+            </wp:cNvGraphicFramePr>
+            <a:graphic xmlns:a="http://schemas.openxmlformats.org/drawingml/2006/main">
+              <a:graphicData uri="http://schemas.openxmlformats.org/drawingml/2006/picture">
+                <pic:pic xmlns:pic="http://schemas.openxmlformats.org/drawingml/2006/picture">
+                  <pic:nvPicPr>
+                    <pic:cNvPr id="0" name="Picture 3"/>
+                    <pic:cNvPicPr>
+                      <a:picLocks noChangeAspect="1" noChangeArrowheads="1"/>
+                    </pic:cNvPicPr>
+                  </pic:nvPicPr>
+                  <pic:blipFill>
+                    <a:blip r:embed="rId9">
+                      <a:extLst>
+                        <a:ext uri="{28A0092B-C50C-407E-A947-70E740481C1C}">
+                          <a14:useLocalDpi xmlns:a14="http://schemas.microsoft.com/office/drawing/2010/main" val="0"/>
+                        </a:ext>
+                      </a:extLst>
+                    </a:blip>
+                    <a:srcRect/>
+                    <a:stretch>
+                      <a:fillRect/>
+                    </a:stretch>
+                  </pic:blipFill>
+                  <pic:spPr bwMode="auto">
+                    <a:xfrm>
+                      <a:off x="0" y="0"/>
+                      <a:ext cx="5394960" cy="2286000"/>
+                    </a:xfrm>
+                    <a:prstGeom prst="rect">
+                      <a:avLst/>
+                    </a:prstGeom>
+                    <a:noFill/>
+                    <a:ln>
+                      <a:noFill/>
+                    </a:ln>
+                  </pic:spPr>
+                </pic:pic>
+              </a:graphicData>
+            </a:graphic>
+          </wp:inline>
+        </w:drawing>
+      </w:r>
+    </w:p>
+    <w:p/>
+    <w:p/>
     <w:p>
       <w:r>
         <w:t>4</w:t>
@@ -256,9 +474,325 @@
       </w:r>
       <w:proofErr w:type="spellEnd"/>
       <w:r>
-        <w:t xml:space="preserve"> em cada </w:t>
-      </w:r>
-    </w:p>
+        <w:t xml:space="preserve"> em </w:t>
+      </w:r>
+      <w:proofErr w:type="gramStart"/>
+      <w:r>
+        <w:t xml:space="preserve">cada </w:t>
+      </w:r>
+      <w:r>
+        <w:t>.</w:t>
+      </w:r>
+      <w:proofErr w:type="gramEnd"/>
+    </w:p>
+    <w:p>
+      <w:r>
+        <w:rPr>
+          <w:noProof/>
+        </w:rPr>
+        <w:lastRenderedPageBreak/>
+        <w:drawing>
+          <wp:inline distT="0" distB="0" distL="0" distR="0" wp14:anchorId="0BD3CF5F" wp14:editId="5E72BBE5">
+            <wp:extent cx="5391150" cy="2276475"/>
+            <wp:effectExtent l="0" t="0" r="0" b="9525"/>
+            <wp:docPr id="819321919" name="Imagem 4"/>
+            <wp:cNvGraphicFramePr>
+              <a:graphicFrameLocks xmlns:a="http://schemas.openxmlformats.org/drawingml/2006/main" noChangeAspect="1"/>
+            </wp:cNvGraphicFramePr>
+            <a:graphic xmlns:a="http://schemas.openxmlformats.org/drawingml/2006/main">
+              <a:graphicData uri="http://schemas.openxmlformats.org/drawingml/2006/picture">
+                <pic:pic xmlns:pic="http://schemas.openxmlformats.org/drawingml/2006/picture">
+                  <pic:nvPicPr>
+                    <pic:cNvPr id="0" name="Picture 4"/>
+                    <pic:cNvPicPr>
+                      <a:picLocks noChangeAspect="1" noChangeArrowheads="1"/>
+                    </pic:cNvPicPr>
+                  </pic:nvPicPr>
+                  <pic:blipFill>
+                    <a:blip r:embed="rId10">
+                      <a:extLst>
+                        <a:ext uri="{28A0092B-C50C-407E-A947-70E740481C1C}">
+                          <a14:useLocalDpi xmlns:a14="http://schemas.microsoft.com/office/drawing/2010/main" val="0"/>
+                        </a:ext>
+                      </a:extLst>
+                    </a:blip>
+                    <a:srcRect/>
+                    <a:stretch>
+                      <a:fillRect/>
+                    </a:stretch>
+                  </pic:blipFill>
+                  <pic:spPr bwMode="auto">
+                    <a:xfrm>
+                      <a:off x="0" y="0"/>
+                      <a:ext cx="5391150" cy="2276475"/>
+                    </a:xfrm>
+                    <a:prstGeom prst="rect">
+                      <a:avLst/>
+                    </a:prstGeom>
+                    <a:noFill/>
+                    <a:ln>
+                      <a:noFill/>
+                    </a:ln>
+                  </pic:spPr>
+                </pic:pic>
+              </a:graphicData>
+            </a:graphic>
+          </wp:inline>
+        </w:drawing>
+      </w:r>
+    </w:p>
+    <w:p>
+      <w:r>
+        <w:rPr>
+          <w:noProof/>
+        </w:rPr>
+        <w:drawing>
+          <wp:inline distT="0" distB="0" distL="0" distR="0" wp14:anchorId="031973E0" wp14:editId="39D4D4D5">
+            <wp:extent cx="5391150" cy="2247900"/>
+            <wp:effectExtent l="0" t="0" r="0" b="0"/>
+            <wp:docPr id="84448656" name="Imagem 5"/>
+            <wp:cNvGraphicFramePr>
+              <a:graphicFrameLocks xmlns:a="http://schemas.openxmlformats.org/drawingml/2006/main" noChangeAspect="1"/>
+            </wp:cNvGraphicFramePr>
+            <a:graphic xmlns:a="http://schemas.openxmlformats.org/drawingml/2006/main">
+              <a:graphicData uri="http://schemas.openxmlformats.org/drawingml/2006/picture">
+                <pic:pic xmlns:pic="http://schemas.openxmlformats.org/drawingml/2006/picture">
+                  <pic:nvPicPr>
+                    <pic:cNvPr id="0" name="Picture 5"/>
+                    <pic:cNvPicPr>
+                      <a:picLocks noChangeAspect="1" noChangeArrowheads="1"/>
+                    </pic:cNvPicPr>
+                  </pic:nvPicPr>
+                  <pic:blipFill>
+                    <a:blip r:embed="rId11">
+                      <a:extLst>
+                        <a:ext uri="{28A0092B-C50C-407E-A947-70E740481C1C}">
+                          <a14:useLocalDpi xmlns:a14="http://schemas.microsoft.com/office/drawing/2010/main" val="0"/>
+                        </a:ext>
+                      </a:extLst>
+                    </a:blip>
+                    <a:srcRect/>
+                    <a:stretch>
+                      <a:fillRect/>
+                    </a:stretch>
+                  </pic:blipFill>
+                  <pic:spPr bwMode="auto">
+                    <a:xfrm>
+                      <a:off x="0" y="0"/>
+                      <a:ext cx="5391150" cy="2247900"/>
+                    </a:xfrm>
+                    <a:prstGeom prst="rect">
+                      <a:avLst/>
+                    </a:prstGeom>
+                    <a:noFill/>
+                    <a:ln>
+                      <a:noFill/>
+                    </a:ln>
+                  </pic:spPr>
+                </pic:pic>
+              </a:graphicData>
+            </a:graphic>
+          </wp:inline>
+        </w:drawing>
+      </w:r>
+    </w:p>
+    <w:p>
+      <w:r>
+        <w:rPr>
+          <w:noProof/>
+        </w:rPr>
+        <w:drawing>
+          <wp:inline distT="0" distB="0" distL="0" distR="0" wp14:anchorId="07B4B536" wp14:editId="15D4731D">
+            <wp:extent cx="5391150" cy="2257425"/>
+            <wp:effectExtent l="0" t="0" r="0" b="9525"/>
+            <wp:docPr id="592510994" name="Imagem 6"/>
+            <wp:cNvGraphicFramePr>
+              <a:graphicFrameLocks xmlns:a="http://schemas.openxmlformats.org/drawingml/2006/main" noChangeAspect="1"/>
+            </wp:cNvGraphicFramePr>
+            <a:graphic xmlns:a="http://schemas.openxmlformats.org/drawingml/2006/main">
+              <a:graphicData uri="http://schemas.openxmlformats.org/drawingml/2006/picture">
+                <pic:pic xmlns:pic="http://schemas.openxmlformats.org/drawingml/2006/picture">
+                  <pic:nvPicPr>
+                    <pic:cNvPr id="0" name="Picture 6"/>
+                    <pic:cNvPicPr>
+                      <a:picLocks noChangeAspect="1" noChangeArrowheads="1"/>
+                    </pic:cNvPicPr>
+                  </pic:nvPicPr>
+                  <pic:blipFill>
+                    <a:blip r:embed="rId12">
+                      <a:extLst>
+                        <a:ext uri="{28A0092B-C50C-407E-A947-70E740481C1C}">
+                          <a14:useLocalDpi xmlns:a14="http://schemas.microsoft.com/office/drawing/2010/main" val="0"/>
+                        </a:ext>
+                      </a:extLst>
+                    </a:blip>
+                    <a:srcRect/>
+                    <a:stretch>
+                      <a:fillRect/>
+                    </a:stretch>
+                  </pic:blipFill>
+                  <pic:spPr bwMode="auto">
+                    <a:xfrm>
+                      <a:off x="0" y="0"/>
+                      <a:ext cx="5391150" cy="2257425"/>
+                    </a:xfrm>
+                    <a:prstGeom prst="rect">
+                      <a:avLst/>
+                    </a:prstGeom>
+                    <a:noFill/>
+                    <a:ln>
+                      <a:noFill/>
+                    </a:ln>
+                  </pic:spPr>
+                </pic:pic>
+              </a:graphicData>
+            </a:graphic>
+          </wp:inline>
+        </w:drawing>
+      </w:r>
+    </w:p>
+    <w:p>
+      <w:r>
+        <w:rPr>
+          <w:noProof/>
+        </w:rPr>
+        <w:lastRenderedPageBreak/>
+        <w:drawing>
+          <wp:inline distT="0" distB="0" distL="0" distR="0" wp14:anchorId="78A2EE44" wp14:editId="504161D3">
+            <wp:extent cx="5400040" cy="2257425"/>
+            <wp:effectExtent l="0" t="0" r="0" b="9525"/>
+            <wp:docPr id="1361621180" name="Imagem 7"/>
+            <wp:cNvGraphicFramePr>
+              <a:graphicFrameLocks xmlns:a="http://schemas.openxmlformats.org/drawingml/2006/main" noChangeAspect="1"/>
+            </wp:cNvGraphicFramePr>
+            <a:graphic xmlns:a="http://schemas.openxmlformats.org/drawingml/2006/main">
+              <a:graphicData uri="http://schemas.openxmlformats.org/drawingml/2006/picture">
+                <pic:pic xmlns:pic="http://schemas.openxmlformats.org/drawingml/2006/picture">
+                  <pic:nvPicPr>
+                    <pic:cNvPr id="0" name="Picture 7"/>
+                    <pic:cNvPicPr>
+                      <a:picLocks noChangeAspect="1" noChangeArrowheads="1"/>
+                    </pic:cNvPicPr>
+                  </pic:nvPicPr>
+                  <pic:blipFill>
+                    <a:blip r:embed="rId13">
+                      <a:extLst>
+                        <a:ext uri="{28A0092B-C50C-407E-A947-70E740481C1C}">
+                          <a14:useLocalDpi xmlns:a14="http://schemas.microsoft.com/office/drawing/2010/main" val="0"/>
+                        </a:ext>
+                      </a:extLst>
+                    </a:blip>
+                    <a:srcRect/>
+                    <a:stretch>
+                      <a:fillRect/>
+                    </a:stretch>
+                  </pic:blipFill>
+                  <pic:spPr bwMode="auto">
+                    <a:xfrm>
+                      <a:off x="0" y="0"/>
+                      <a:ext cx="5400040" cy="2257425"/>
+                    </a:xfrm>
+                    <a:prstGeom prst="rect">
+                      <a:avLst/>
+                    </a:prstGeom>
+                    <a:noFill/>
+                    <a:ln>
+                      <a:noFill/>
+                    </a:ln>
+                  </pic:spPr>
+                </pic:pic>
+              </a:graphicData>
+            </a:graphic>
+          </wp:inline>
+        </w:drawing>
+      </w:r>
+    </w:p>
+    <w:p>
+      <w:r>
+        <w:rPr>
+          <w:noProof/>
+        </w:rPr>
+        <w:drawing>
+          <wp:inline distT="0" distB="0" distL="0" distR="0" wp14:anchorId="67D58972" wp14:editId="79D006B5">
+            <wp:extent cx="5400040" cy="3035935"/>
+            <wp:effectExtent l="0" t="0" r="0" b="0"/>
+            <wp:docPr id="1055541383" name="Imagem 1" descr="Tela de celular com publicação numa rede social&#10;&#10;Descrição gerada automaticamente"/>
+            <wp:cNvGraphicFramePr>
+              <a:graphicFrameLocks xmlns:a="http://schemas.openxmlformats.org/drawingml/2006/main" noChangeAspect="1"/>
+            </wp:cNvGraphicFramePr>
+            <a:graphic xmlns:a="http://schemas.openxmlformats.org/drawingml/2006/main">
+              <a:graphicData uri="http://schemas.openxmlformats.org/drawingml/2006/picture">
+                <pic:pic xmlns:pic="http://schemas.openxmlformats.org/drawingml/2006/picture">
+                  <pic:nvPicPr>
+                    <pic:cNvPr id="1055541383" name="Imagem 1" descr="Tela de celular com publicação numa rede social&#10;&#10;Descrição gerada automaticamente"/>
+                    <pic:cNvPicPr/>
+                  </pic:nvPicPr>
+                  <pic:blipFill>
+                    <a:blip r:embed="rId14"/>
+                    <a:stretch>
+                      <a:fillRect/>
+                    </a:stretch>
+                  </pic:blipFill>
+                  <pic:spPr>
+                    <a:xfrm>
+                      <a:off x="0" y="0"/>
+                      <a:ext cx="5400040" cy="3035935"/>
+                    </a:xfrm>
+                    <a:prstGeom prst="rect">
+                      <a:avLst/>
+                    </a:prstGeom>
+                  </pic:spPr>
+                </pic:pic>
+              </a:graphicData>
+            </a:graphic>
+          </wp:inline>
+        </w:drawing>
+      </w:r>
+    </w:p>
+    <w:p>
+      <w:r>
+        <w:rPr>
+          <w:noProof/>
+        </w:rPr>
+        <w:drawing>
+          <wp:inline distT="0" distB="0" distL="0" distR="0" wp14:anchorId="3655ED99" wp14:editId="722E4528">
+            <wp:extent cx="5400040" cy="3035935"/>
+            <wp:effectExtent l="0" t="0" r="0" b="0"/>
+            <wp:docPr id="1602218321" name="Imagem 1" descr="Tela de celular com publicação numa rede social&#10;&#10;Descrição gerada automaticamente"/>
+            <wp:cNvGraphicFramePr>
+              <a:graphicFrameLocks xmlns:a="http://schemas.openxmlformats.org/drawingml/2006/main" noChangeAspect="1"/>
+            </wp:cNvGraphicFramePr>
+            <a:graphic xmlns:a="http://schemas.openxmlformats.org/drawingml/2006/main">
+              <a:graphicData uri="http://schemas.openxmlformats.org/drawingml/2006/picture">
+                <pic:pic xmlns:pic="http://schemas.openxmlformats.org/drawingml/2006/picture">
+                  <pic:nvPicPr>
+                    <pic:cNvPr id="1602218321" name="Imagem 1" descr="Tela de celular com publicação numa rede social&#10;&#10;Descrição gerada automaticamente"/>
+                    <pic:cNvPicPr/>
+                  </pic:nvPicPr>
+                  <pic:blipFill>
+                    <a:blip r:embed="rId15"/>
+                    <a:stretch>
+                      <a:fillRect/>
+                    </a:stretch>
+                  </pic:blipFill>
+                  <pic:spPr>
+                    <a:xfrm>
+                      <a:off x="0" y="0"/>
+                      <a:ext cx="5400040" cy="3035935"/>
+                    </a:xfrm>
+                    <a:prstGeom prst="rect">
+                      <a:avLst/>
+                    </a:prstGeom>
+                  </pic:spPr>
+                </pic:pic>
+              </a:graphicData>
+            </a:graphic>
+          </wp:inline>
+        </w:drawing>
+      </w:r>
+    </w:p>
+    <w:p/>
+    <w:p/>
     <w:p>
       <w:r>
         <w:t>4</w:t>
@@ -406,7 +940,6 @@
     </w:p>
     <w:p>
       <w:r>
-        <w:lastRenderedPageBreak/>
         <w:t xml:space="preserve">Na IDE </w:t>
       </w:r>
       <w:proofErr w:type="spellStart"/>
@@ -652,7 +1185,7 @@
       <w:r>
         <w:t xml:space="preserve">de IA que é: </w:t>
       </w:r>
-      <w:hyperlink r:id="rId5" w:history="1">
+      <w:hyperlink r:id="rId16" w:history="1">
         <w:r>
           <w:rPr>
             <w:rStyle w:val="Hyperlink"/>
@@ -876,6 +1409,7 @@
           <w:b/>
           <w:bCs/>
         </w:rPr>
+        <w:lastRenderedPageBreak/>
         <w:t>Título:</w:t>
       </w:r>
       <w:r>
@@ -1035,7 +1569,6 @@
           <w:b/>
           <w:bCs/>
         </w:rPr>
-        <w:lastRenderedPageBreak/>
         <w:t>Objetivo do Relatório:</w:t>
       </w:r>
       <w:r>
@@ -1407,6 +1940,7 @@
           <w:b/>
           <w:bCs/>
         </w:rPr>
+        <w:lastRenderedPageBreak/>
         <w:t>4.2. Avaliação das Modificações Individuais (Atende ao Item 4):</w:t>
       </w:r>
     </w:p>
@@ -1531,7 +2065,6 @@
         </w:numPr>
       </w:pPr>
       <w:r>
-        <w:lastRenderedPageBreak/>
         <w:t>Comente o resultado da aplicação das 3 modificações juntas. Ocorreu ganho ou o modelo "quebrou"?</w:t>
       </w:r>
     </w:p>
@@ -1726,6 +2259,7 @@
           <w:sz w:val="28"/>
           <w:szCs w:val="28"/>
         </w:rPr>
+        <w:lastRenderedPageBreak/>
         <w:t>Detalhes do artigo escolhido</w:t>
       </w:r>
       <w:r>
@@ -1935,7 +2469,7 @@
       <w:r>
         <w:t>: </w:t>
       </w:r>
-      <w:hyperlink r:id="rId6" w:history="1">
+      <w:hyperlink r:id="rId17" w:history="1">
         <w:r>
           <w:rPr>
             <w:rStyle w:val="Hyperlink"/>
@@ -1988,7 +2522,6 @@
     </w:p>
     <w:p>
       <w:r>
-        <w:lastRenderedPageBreak/>
         <w:t xml:space="preserve">Por que ele usa exatamente o nosso </w:t>
       </w:r>
       <w:proofErr w:type="spellStart"/>
@@ -3999,7 +4532,6 @@
     <w:next w:val="Normal"/>
     <w:link w:val="Ttulo3Char"/>
     <w:uiPriority w:val="9"/>
-    <w:semiHidden/>
     <w:unhideWhenUsed/>
     <w:qFormat/>
     <w:rsid w:val="00D94337"/>
@@ -4206,7 +4738,6 @@
     <w:basedOn w:val="Fontepargpadro"/>
     <w:link w:val="Ttulo3"/>
     <w:uiPriority w:val="9"/>
-    <w:semiHidden/>
     <w:rsid w:val="00D94337"/>
     <w:rPr>
       <w:rFonts w:eastAsiaTheme="majorEastAsia" w:cstheme="majorBidi"/>

</xml_diff>